<commit_message>
Add annotated images to user guide
</commit_message>
<xml_diff>
--- a/docs/Aps_Pickle_Zone_User_Guide.docx
+++ b/docs/Aps_Pickle_Zone_User_Guide.docx
@@ -13,7 +13,13 @@
     <w:p/>
     <w:p>
       <w:r>
-        <w:t>Version: 1.0</w:t>
+        <w:t>Version: 1.1</w:t>
+      </w:r>
+    </w:p>
+    <w:p/>
+    <w:p>
+      <w:r>
+        <w:t>This guide is a step-by-step manual for customers, admins, and system owners. Red circles in the interface images show the exact button, field, or content area to use.</w:t>
       </w:r>
     </w:p>
     <w:p/>
@@ -246,7 +252,781 @@
         <w:pStyle w:val="Heading1"/>
       </w:pPr>
       <w:r>
-        <w:t>3. Accessing the App</w:t>
+        <w:t>3. Visual Step-by-Step Customer Guide</w:t>
+      </w:r>
+    </w:p>
+    <w:p/>
+    <w:p>
+      <w:pPr>
+        <w:pStyle w:val="Heading2"/>
+      </w:pPr>
+      <w:r>
+        <w:t>Customer Dashboard</w:t>
+      </w:r>
+    </w:p>
+    <w:p/>
+    <w:p>
+      <w:pPr>
+        <w:jc w:val="center"/>
+      </w:pPr>
+      <w:r>
+        <w:drawing>
+          <wp:inline xmlns:wp="http://schemas.openxmlformats.org/drawingml/2006/wordprocessingDrawing" distT="0" distB="0" distL="0" distR="0">
+            <wp:extent cx="6500000" cy="4164062"/>
+            <wp:docPr id="2" name="Annotated customer dashboard"/>
+            <a:graphic xmlns:a="http://schemas.openxmlformats.org/drawingml/2006/main">
+              <a:graphicData uri="http://schemas.openxmlformats.org/drawingml/2006/picture">
+                <pic:pic xmlns:pic="http://schemas.openxmlformats.org/drawingml/2006/picture">
+                  <pic:nvPicPr>
+                    <pic:cNvPr id="0" name="Annotated customer dashboard"/>
+                    <pic:cNvPicPr/>
+                  </pic:nvPicPr>
+                  <pic:blipFill>
+                    <a:blip xmlns:r="http://schemas.openxmlformats.org/officeDocument/2006/relationships" r:embed="rId2"/>
+                    <a:stretch>
+                      <a:fillRect/>
+                    </a:stretch>
+                  </pic:blipFill>
+                  <pic:spPr>
+                    <a:xfrm>
+                      <a:off x="0" y="0"/>
+                      <a:ext cx="6500000" cy="4164062"/>
+                    </a:xfrm>
+                    <a:prstGeom prst="rect">
+                      <a:avLst/>
+                    </a:prstGeom>
+                  </pic:spPr>
+                </pic:pic>
+              </a:graphicData>
+            </a:graphic>
+          </wp:inline>
+        </w:drawing>
+      </w:r>
+    </w:p>
+    <w:p/>
+    <w:p>
+      <w:pPr>
+        <w:pStyle w:val="ListNumber"/>
+        <w:ind w:left="720"/>
+      </w:pPr>
+      <w:r>
+        <w:t>1. Select Book a Court to create a new reservation.</w:t>
+      </w:r>
+    </w:p>
+    <w:p>
+      <w:pPr>
+        <w:pStyle w:val="ListNumber"/>
+        <w:ind w:left="720"/>
+      </w:pPr>
+      <w:r>
+        <w:t>2. Check recent admin messages and booking updates in Notifications.</w:t>
+      </w:r>
+    </w:p>
+    <w:p>
+      <w:pPr>
+        <w:pStyle w:val="ListNumber"/>
+        <w:ind w:left="720"/>
+      </w:pPr>
+      <w:r>
+        <w:t>3. Use Dashboard and Progress to monitor court hours, streaks, and productivity.</w:t>
+      </w:r>
+    </w:p>
+    <w:p/>
+    <w:p>
+      <w:pPr>
+        <w:pStyle w:val="Heading2"/>
+      </w:pPr>
+      <w:r>
+        <w:t>Book a Court</w:t>
+      </w:r>
+    </w:p>
+    <w:p/>
+    <w:p>
+      <w:pPr>
+        <w:jc w:val="center"/>
+      </w:pPr>
+      <w:r>
+        <w:drawing>
+          <wp:inline xmlns:wp="http://schemas.openxmlformats.org/drawingml/2006/wordprocessingDrawing" distT="0" distB="0" distL="0" distR="0">
+            <wp:extent cx="6500000" cy="4164062"/>
+            <wp:docPr id="3" name="Annotated booking form"/>
+            <a:graphic xmlns:a="http://schemas.openxmlformats.org/drawingml/2006/main">
+              <a:graphicData uri="http://schemas.openxmlformats.org/drawingml/2006/picture">
+                <pic:pic xmlns:pic="http://schemas.openxmlformats.org/drawingml/2006/picture">
+                  <pic:nvPicPr>
+                    <pic:cNvPr id="0" name="Annotated booking form"/>
+                    <pic:cNvPicPr/>
+                  </pic:nvPicPr>
+                  <pic:blipFill>
+                    <a:blip xmlns:r="http://schemas.openxmlformats.org/officeDocument/2006/relationships" r:embed="rId3"/>
+                    <a:stretch>
+                      <a:fillRect/>
+                    </a:stretch>
+                  </pic:blipFill>
+                  <pic:spPr>
+                    <a:xfrm>
+                      <a:off x="0" y="0"/>
+                      <a:ext cx="6500000" cy="4164062"/>
+                    </a:xfrm>
+                    <a:prstGeom prst="rect">
+                      <a:avLst/>
+                    </a:prstGeom>
+                  </pic:spPr>
+                </pic:pic>
+              </a:graphicData>
+            </a:graphic>
+          </wp:inline>
+        </w:drawing>
+      </w:r>
+    </w:p>
+    <w:p/>
+    <w:p>
+      <w:pPr>
+        <w:pStyle w:val="ListNumber"/>
+        <w:ind w:left="720"/>
+      </w:pPr>
+      <w:r>
+        <w:t>1. Select the court, date, start time, and duration.</w:t>
+      </w:r>
+    </w:p>
+    <w:p>
+      <w:pPr>
+        <w:pStyle w:val="ListNumber"/>
+        <w:ind w:left="720"/>
+      </w:pPr>
+      <w:r>
+        <w:t>2. Confirm the slot is available.</w:t>
+      </w:r>
+    </w:p>
+    <w:p>
+      <w:pPr>
+        <w:pStyle w:val="ListNumber"/>
+        <w:ind w:left="720"/>
+      </w:pPr>
+      <w:r>
+        <w:t>3. Select Submit Booking Request.</w:t>
+      </w:r>
+    </w:p>
+    <w:p/>
+    <w:p>
+      <w:r>
+        <w:t>Booking rules:</w:t>
+      </w:r>
+    </w:p>
+    <w:p/>
+    <w:p>
+      <w:pPr>
+        <w:pStyle w:val="ListBullet"/>
+        <w:ind w:left="720"/>
+      </w:pPr>
+      <w:r>
+        <w:t>- Court rate is PHP 250.00 per hour.</w:t>
+      </w:r>
+    </w:p>
+    <w:p>
+      <w:pPr>
+        <w:pStyle w:val="ListBullet"/>
+        <w:ind w:left="720"/>
+      </w:pPr>
+      <w:r>
+        <w:t>- Default maximum booking duration is 4 hours.</w:t>
+      </w:r>
+    </w:p>
+    <w:p>
+      <w:pPr>
+        <w:pStyle w:val="ListBullet"/>
+        <w:ind w:left="720"/>
+      </w:pPr>
+      <w:r>
+        <w:t>- Bookings can run up to 11:00 PM.</w:t>
+      </w:r>
+    </w:p>
+    <w:p>
+      <w:pPr>
+        <w:pStyle w:val="ListBullet"/>
+        <w:ind w:left="720"/>
+      </w:pPr>
+      <w:r>
+        <w:t>- Pending, approved, and active bookings block overlapping reservations.</w:t>
+      </w:r>
+    </w:p>
+    <w:p>
+      <w:pPr>
+        <w:pStyle w:val="ListBullet"/>
+        <w:ind w:left="720"/>
+      </w:pPr>
+      <w:r>
+        <w:t>- Maintenance blocks prevent booking affected courts.</w:t>
+      </w:r>
+    </w:p>
+    <w:p/>
+    <w:p>
+      <w:pPr>
+        <w:pStyle w:val="Heading2"/>
+      </w:pPr>
+      <w:r>
+        <w:t>Bookings and Payment Proof</w:t>
+      </w:r>
+    </w:p>
+    <w:p/>
+    <w:p>
+      <w:pPr>
+        <w:jc w:val="center"/>
+      </w:pPr>
+      <w:r>
+        <w:drawing>
+          <wp:inline xmlns:wp="http://schemas.openxmlformats.org/drawingml/2006/wordprocessingDrawing" distT="0" distB="0" distL="0" distR="0">
+            <wp:extent cx="6500000" cy="4164062"/>
+            <wp:docPr id="4" name="Annotated booking and payment proof screen"/>
+            <a:graphic xmlns:a="http://schemas.openxmlformats.org/drawingml/2006/main">
+              <a:graphicData uri="http://schemas.openxmlformats.org/drawingml/2006/picture">
+                <pic:pic xmlns:pic="http://schemas.openxmlformats.org/drawingml/2006/picture">
+                  <pic:nvPicPr>
+                    <pic:cNvPr id="0" name="Annotated booking and payment proof screen"/>
+                    <pic:cNvPicPr/>
+                  </pic:nvPicPr>
+                  <pic:blipFill>
+                    <a:blip xmlns:r="http://schemas.openxmlformats.org/officeDocument/2006/relationships" r:embed="rId4"/>
+                    <a:stretch>
+                      <a:fillRect/>
+                    </a:stretch>
+                  </pic:blipFill>
+                  <pic:spPr>
+                    <a:xfrm>
+                      <a:off x="0" y="0"/>
+                      <a:ext cx="6500000" cy="4164062"/>
+                    </a:xfrm>
+                    <a:prstGeom prst="rect">
+                      <a:avLst/>
+                    </a:prstGeom>
+                  </pic:spPr>
+                </pic:pic>
+              </a:graphicData>
+            </a:graphic>
+          </wp:inline>
+        </w:drawing>
+      </w:r>
+    </w:p>
+    <w:p/>
+    <w:p>
+      <w:pPr>
+        <w:pStyle w:val="ListNumber"/>
+        <w:ind w:left="720"/>
+      </w:pPr>
+      <w:r>
+        <w:t>1. Open Bookings.</w:t>
+      </w:r>
+    </w:p>
+    <w:p>
+      <w:pPr>
+        <w:pStyle w:val="ListNumber"/>
+        <w:ind w:left="720"/>
+      </w:pPr>
+      <w:r>
+        <w:t>2. Select the booking row.</w:t>
+      </w:r>
+    </w:p>
+    <w:p>
+      <w:pPr>
+        <w:pStyle w:val="ListNumber"/>
+        <w:ind w:left="720"/>
+      </w:pPr>
+      <w:r>
+        <w:t>3. Choose a JPG, PNG, or PDF payment proof.</w:t>
+      </w:r>
+    </w:p>
+    <w:p>
+      <w:pPr>
+        <w:pStyle w:val="ListNumber"/>
+        <w:ind w:left="720"/>
+      </w:pPr>
+      <w:r>
+        <w:t>4. Select Upload Proof.</w:t>
+      </w:r>
+    </w:p>
+    <w:p>
+      <w:pPr>
+        <w:pStyle w:val="ListNumber"/>
+        <w:ind w:left="720"/>
+      </w:pPr>
+      <w:r>
+        <w:t>5. Use Print Receipt when the booking is billable.</w:t>
+      </w:r>
+    </w:p>
+    <w:p/>
+    <w:p>
+      <w:r>
+        <w:t>Payment proof files must be 8 MB or smaller.</w:t>
+      </w:r>
+    </w:p>
+    <w:p/>
+    <w:p>
+      <w:pPr>
+        <w:pStyle w:val="Heading2"/>
+      </w:pPr>
+      <w:r>
+        <w:t>Client Notifications</w:t>
+      </w:r>
+    </w:p>
+    <w:p/>
+    <w:p>
+      <w:pPr>
+        <w:jc w:val="center"/>
+      </w:pPr>
+      <w:r>
+        <w:drawing>
+          <wp:inline xmlns:wp="http://schemas.openxmlformats.org/drawingml/2006/wordprocessingDrawing" distT="0" distB="0" distL="0" distR="0">
+            <wp:extent cx="6500000" cy="4164062"/>
+            <wp:docPr id="5" name="Annotated client notifications"/>
+            <a:graphic xmlns:a="http://schemas.openxmlformats.org/drawingml/2006/main">
+              <a:graphicData uri="http://schemas.openxmlformats.org/drawingml/2006/picture">
+                <pic:pic xmlns:pic="http://schemas.openxmlformats.org/drawingml/2006/picture">
+                  <pic:nvPicPr>
+                    <pic:cNvPr id="0" name="Annotated client notifications"/>
+                    <pic:cNvPicPr/>
+                  </pic:nvPicPr>
+                  <pic:blipFill>
+                    <a:blip xmlns:r="http://schemas.openxmlformats.org/officeDocument/2006/relationships" r:embed="rId5"/>
+                    <a:stretch>
+                      <a:fillRect/>
+                    </a:stretch>
+                  </pic:blipFill>
+                  <pic:spPr>
+                    <a:xfrm>
+                      <a:off x="0" y="0"/>
+                      <a:ext cx="6500000" cy="4164062"/>
+                    </a:xfrm>
+                    <a:prstGeom prst="rect">
+                      <a:avLst/>
+                    </a:prstGeom>
+                  </pic:spPr>
+                </pic:pic>
+              </a:graphicData>
+            </a:graphic>
+          </wp:inline>
+        </w:drawing>
+      </w:r>
+    </w:p>
+    <w:p/>
+    <w:p>
+      <w:pPr>
+        <w:pStyle w:val="ListNumber"/>
+        <w:ind w:left="720"/>
+      </w:pPr>
+      <w:r>
+        <w:t>1. Open Notifications to view booking updates and admin messages.</w:t>
+      </w:r>
+    </w:p>
+    <w:p>
+      <w:pPr>
+        <w:pStyle w:val="ListNumber"/>
+        <w:ind w:left="720"/>
+      </w:pPr>
+      <w:r>
+        <w:t>2. Admin messages appear as full content cards.</w:t>
+      </w:r>
+    </w:p>
+    <w:p>
+      <w:pPr>
+        <w:pStyle w:val="ListNumber"/>
+        <w:ind w:left="720"/>
+      </w:pPr>
+      <w:r>
+        <w:t>3. Use Mark Read or Mark All Read to clear unread indicators.</w:t>
+      </w:r>
+    </w:p>
+    <w:p/>
+    <w:p>
+      <w:pPr>
+        <w:pStyle w:val="Heading2"/>
+      </w:pPr>
+      <w:r>
+        <w:t>Profile Update</w:t>
+      </w:r>
+    </w:p>
+    <w:p/>
+    <w:p>
+      <w:pPr>
+        <w:jc w:val="center"/>
+      </w:pPr>
+      <w:r>
+        <w:drawing>
+          <wp:inline xmlns:wp="http://schemas.openxmlformats.org/drawingml/2006/wordprocessingDrawing" distT="0" distB="0" distL="0" distR="0">
+            <wp:extent cx="6500000" cy="4164062"/>
+            <wp:docPr id="6" name="Annotated profile update screen"/>
+            <a:graphic xmlns:a="http://schemas.openxmlformats.org/drawingml/2006/main">
+              <a:graphicData uri="http://schemas.openxmlformats.org/drawingml/2006/picture">
+                <pic:pic xmlns:pic="http://schemas.openxmlformats.org/drawingml/2006/picture">
+                  <pic:nvPicPr>
+                    <pic:cNvPr id="0" name="Annotated profile update screen"/>
+                    <pic:cNvPicPr/>
+                  </pic:nvPicPr>
+                  <pic:blipFill>
+                    <a:blip xmlns:r="http://schemas.openxmlformats.org/officeDocument/2006/relationships" r:embed="rId6"/>
+                    <a:stretch>
+                      <a:fillRect/>
+                    </a:stretch>
+                  </pic:blipFill>
+                  <pic:spPr>
+                    <a:xfrm>
+                      <a:off x="0" y="0"/>
+                      <a:ext cx="6500000" cy="4164062"/>
+                    </a:xfrm>
+                    <a:prstGeom prst="rect">
+                      <a:avLst/>
+                    </a:prstGeom>
+                  </pic:spPr>
+                </pic:pic>
+              </a:graphicData>
+            </a:graphic>
+          </wp:inline>
+        </w:drawing>
+      </w:r>
+    </w:p>
+    <w:p/>
+    <w:p>
+      <w:pPr>
+        <w:pStyle w:val="ListNumber"/>
+        <w:ind w:left="720"/>
+      </w:pPr>
+      <w:r>
+        <w:t>1. Open Profile.</w:t>
+      </w:r>
+    </w:p>
+    <w:p>
+      <w:pPr>
+        <w:pStyle w:val="ListNumber"/>
+        <w:ind w:left="720"/>
+      </w:pPr>
+      <w:r>
+        <w:t>2. Select Change Profile Photo to choose a JPG or PNG image.</w:t>
+      </w:r>
+    </w:p>
+    <w:p>
+      <w:pPr>
+        <w:pStyle w:val="ListNumber"/>
+        <w:ind w:left="720"/>
+      </w:pPr>
+      <w:r>
+        <w:t>3. Edit full name or contact number if needed.</w:t>
+      </w:r>
+    </w:p>
+    <w:p>
+      <w:pPr>
+        <w:pStyle w:val="ListNumber"/>
+        <w:ind w:left="720"/>
+      </w:pPr>
+      <w:r>
+        <w:t>4. Select Save Profile.</w:t>
+      </w:r>
+    </w:p>
+    <w:p/>
+    <w:p>
+      <w:r>
+        <w:t>Profile photos must be 15 MB or smaller. The image preview updates immediately after selection and after saving.</w:t>
+      </w:r>
+    </w:p>
+    <w:p/>
+    <w:p>
+      <w:pPr>
+        <w:pStyle w:val="Heading1"/>
+      </w:pPr>
+      <w:r>
+        <w:t>4. Visual Step-by-Step Admin Guide</w:t>
+      </w:r>
+    </w:p>
+    <w:p/>
+    <w:p>
+      <w:pPr>
+        <w:pStyle w:val="Heading2"/>
+      </w:pPr>
+      <w:r>
+        <w:t>Admin Booking Review</w:t>
+      </w:r>
+    </w:p>
+    <w:p/>
+    <w:p>
+      <w:pPr>
+        <w:jc w:val="center"/>
+      </w:pPr>
+      <w:r>
+        <w:drawing>
+          <wp:inline xmlns:wp="http://schemas.openxmlformats.org/drawingml/2006/wordprocessingDrawing" distT="0" distB="0" distL="0" distR="0">
+            <wp:extent cx="6500000" cy="4164062"/>
+            <wp:docPr id="7" name="Annotated admin booking review"/>
+            <a:graphic xmlns:a="http://schemas.openxmlformats.org/drawingml/2006/main">
+              <a:graphicData uri="http://schemas.openxmlformats.org/drawingml/2006/picture">
+                <pic:pic xmlns:pic="http://schemas.openxmlformats.org/drawingml/2006/picture">
+                  <pic:nvPicPr>
+                    <pic:cNvPr id="0" name="Annotated admin booking review"/>
+                    <pic:cNvPicPr/>
+                  </pic:nvPicPr>
+                  <pic:blipFill>
+                    <a:blip xmlns:r="http://schemas.openxmlformats.org/officeDocument/2006/relationships" r:embed="rId7"/>
+                    <a:stretch>
+                      <a:fillRect/>
+                    </a:stretch>
+                  </pic:blipFill>
+                  <pic:spPr>
+                    <a:xfrm>
+                      <a:off x="0" y="0"/>
+                      <a:ext cx="6500000" cy="4164062"/>
+                    </a:xfrm>
+                    <a:prstGeom prst="rect">
+                      <a:avLst/>
+                    </a:prstGeom>
+                  </pic:spPr>
+                </pic:pic>
+              </a:graphicData>
+            </a:graphic>
+          </wp:inline>
+        </w:drawing>
+      </w:r>
+    </w:p>
+    <w:p/>
+    <w:p>
+      <w:pPr>
+        <w:pStyle w:val="ListNumber"/>
+        <w:ind w:left="720"/>
+      </w:pPr>
+      <w:r>
+        <w:t>1. Open Bookings or select a recent request from the Admin Dashboard.</w:t>
+      </w:r>
+    </w:p>
+    <w:p>
+      <w:pPr>
+        <w:pStyle w:val="ListNumber"/>
+        <w:ind w:left="720"/>
+      </w:pPr>
+      <w:r>
+        <w:t>2. Review the booking details and payment proof.</w:t>
+      </w:r>
+    </w:p>
+    <w:p>
+      <w:pPr>
+        <w:pStyle w:val="ListNumber"/>
+        <w:ind w:left="720"/>
+      </w:pPr>
+      <w:r>
+        <w:t>3. Select Approve for valid paid bookings.</w:t>
+      </w:r>
+    </w:p>
+    <w:p>
+      <w:pPr>
+        <w:pStyle w:val="ListNumber"/>
+        <w:ind w:left="720"/>
+      </w:pPr>
+      <w:r>
+        <w:t>4. Select Decline or Cancel when needed and include an admin note.</w:t>
+      </w:r>
+    </w:p>
+    <w:p>
+      <w:pPr>
+        <w:pStyle w:val="ListNumber"/>
+        <w:ind w:left="720"/>
+      </w:pPr>
+      <w:r>
+        <w:t>5. Select Complete when the rental is finished.</w:t>
+      </w:r>
+    </w:p>
+    <w:p/>
+    <w:p>
+      <w:pPr>
+        <w:pStyle w:val="Heading2"/>
+      </w:pPr>
+      <w:r>
+        <w:t>Customer Management and Direct Messages</w:t>
+      </w:r>
+    </w:p>
+    <w:p/>
+    <w:p>
+      <w:pPr>
+        <w:jc w:val="center"/>
+      </w:pPr>
+      <w:r>
+        <w:drawing>
+          <wp:inline xmlns:wp="http://schemas.openxmlformats.org/drawingml/2006/wordprocessingDrawing" distT="0" distB="0" distL="0" distR="0">
+            <wp:extent cx="6500000" cy="4164062"/>
+            <wp:docPr id="8" name="Annotated admin customer notification"/>
+            <a:graphic xmlns:a="http://schemas.openxmlformats.org/drawingml/2006/main">
+              <a:graphicData uri="http://schemas.openxmlformats.org/drawingml/2006/picture">
+                <pic:pic xmlns:pic="http://schemas.openxmlformats.org/drawingml/2006/picture">
+                  <pic:nvPicPr>
+                    <pic:cNvPr id="0" name="Annotated admin customer notification"/>
+                    <pic:cNvPicPr/>
+                  </pic:nvPicPr>
+                  <pic:blipFill>
+                    <a:blip xmlns:r="http://schemas.openxmlformats.org/officeDocument/2006/relationships" r:embed="rId8"/>
+                    <a:stretch>
+                      <a:fillRect/>
+                    </a:stretch>
+                  </pic:blipFill>
+                  <pic:spPr>
+                    <a:xfrm>
+                      <a:off x="0" y="0"/>
+                      <a:ext cx="6500000" cy="4164062"/>
+                    </a:xfrm>
+                    <a:prstGeom prst="rect">
+                      <a:avLst/>
+                    </a:prstGeom>
+                  </pic:spPr>
+                </pic:pic>
+              </a:graphicData>
+            </a:graphic>
+          </wp:inline>
+        </w:drawing>
+      </w:r>
+    </w:p>
+    <w:p/>
+    <w:p>
+      <w:pPr>
+        <w:pStyle w:val="ListNumber"/>
+        <w:ind w:left="720"/>
+      </w:pPr>
+      <w:r>
+        <w:t>1. Open Customers.</w:t>
+      </w:r>
+    </w:p>
+    <w:p>
+      <w:pPr>
+        <w:pStyle w:val="ListNumber"/>
+        <w:ind w:left="720"/>
+      </w:pPr>
+      <w:r>
+        <w:t>2. Review customer profile photos, contact details, bookings, and payments.</w:t>
+      </w:r>
+    </w:p>
+    <w:p>
+      <w:pPr>
+        <w:pStyle w:val="ListNumber"/>
+        <w:ind w:left="720"/>
+      </w:pPr>
+      <w:r>
+        <w:t>3. Select Notify.</w:t>
+      </w:r>
+    </w:p>
+    <w:p>
+      <w:pPr>
+        <w:pStyle w:val="ListNumber"/>
+        <w:ind w:left="720"/>
+      </w:pPr>
+      <w:r>
+        <w:t>4. Add a title and message.</w:t>
+      </w:r>
+    </w:p>
+    <w:p>
+      <w:pPr>
+        <w:pStyle w:val="ListNumber"/>
+        <w:ind w:left="720"/>
+      </w:pPr>
+      <w:r>
+        <w:t>5. Select Send.</w:t>
+      </w:r>
+    </w:p>
+    <w:p/>
+    <w:p>
+      <w:r>
+        <w:t>The message appears in the customer's Notifications page as a full admin message card.</w:t>
+      </w:r>
+    </w:p>
+    <w:p/>
+    <w:p>
+      <w:pPr>
+        <w:pStyle w:val="Heading2"/>
+      </w:pPr>
+      <w:r>
+        <w:t>Reports and Maintenance</w:t>
+      </w:r>
+    </w:p>
+    <w:p/>
+    <w:p>
+      <w:pPr>
+        <w:jc w:val="center"/>
+      </w:pPr>
+      <w:r>
+        <w:drawing>
+          <wp:inline xmlns:wp="http://schemas.openxmlformats.org/drawingml/2006/wordprocessingDrawing" distT="0" distB="0" distL="0" distR="0">
+            <wp:extent cx="6500000" cy="4164062"/>
+            <wp:docPr id="9" name="Annotated reports and maintenance"/>
+            <a:graphic xmlns:a="http://schemas.openxmlformats.org/drawingml/2006/main">
+              <a:graphicData uri="http://schemas.openxmlformats.org/drawingml/2006/picture">
+                <pic:pic xmlns:pic="http://schemas.openxmlformats.org/drawingml/2006/picture">
+                  <pic:nvPicPr>
+                    <pic:cNvPr id="0" name="Annotated reports and maintenance"/>
+                    <pic:cNvPicPr/>
+                  </pic:nvPicPr>
+                  <pic:blipFill>
+                    <a:blip xmlns:r="http://schemas.openxmlformats.org/officeDocument/2006/relationships" r:embed="rId9"/>
+                    <a:stretch>
+                      <a:fillRect/>
+                    </a:stretch>
+                  </pic:blipFill>
+                  <pic:spPr>
+                    <a:xfrm>
+                      <a:off x="0" y="0"/>
+                      <a:ext cx="6500000" cy="4164062"/>
+                    </a:xfrm>
+                    <a:prstGeom prst="rect">
+                      <a:avLst/>
+                    </a:prstGeom>
+                  </pic:spPr>
+                </pic:pic>
+              </a:graphicData>
+            </a:graphic>
+          </wp:inline>
+        </w:drawing>
+      </w:r>
+    </w:p>
+    <w:p/>
+    <w:p>
+      <w:pPr>
+        <w:pStyle w:val="ListNumber"/>
+        <w:ind w:left="720"/>
+      </w:pPr>
+      <w:r>
+        <w:t>1. Open Reports to review income, top renters, most rented court, and booking status summaries.</w:t>
+      </w:r>
+    </w:p>
+    <w:p>
+      <w:pPr>
+        <w:pStyle w:val="ListNumber"/>
+        <w:ind w:left="720"/>
+      </w:pPr>
+      <w:r>
+        <w:t>2. Open Maintenance to block court time for repairs or private events.</w:t>
+      </w:r>
+    </w:p>
+    <w:p>
+      <w:pPr>
+        <w:pStyle w:val="ListNumber"/>
+        <w:ind w:left="720"/>
+      </w:pPr>
+      <w:r>
+        <w:t>3. Select court, date, time, duration, and reason.</w:t>
+      </w:r>
+    </w:p>
+    <w:p>
+      <w:pPr>
+        <w:pStyle w:val="ListNumber"/>
+        <w:ind w:left="720"/>
+      </w:pPr>
+      <w:r>
+        <w:t>4. Select Schedule Maintenance.</w:t>
+      </w:r>
+    </w:p>
+    <w:p/>
+    <w:p>
+      <w:r>
+        <w:t>Maintenance blocks prevent new bookings in the affected time range.</w:t>
+      </w:r>
+    </w:p>
+    <w:p/>
+    <w:p>
+      <w:pPr>
+        <w:pStyle w:val="Heading1"/>
+      </w:pPr>
+      <w:r>
+        <w:t>5. Accessing the App</w:t>
       </w:r>
     </w:p>
     <w:p/>
@@ -292,7 +1072,7 @@
         <w:pStyle w:val="Heading1"/>
       </w:pPr>
       <w:r>
-        <w:t>4. Customer Guide</w:t>
+        <w:t>6. Customer Reference</w:t>
       </w:r>
     </w:p>
     <w:p/>
@@ -396,192 +1176,6 @@
         <w:pStyle w:val="Heading2"/>
       </w:pPr>
       <w:r>
-        <w:t>Book a Court</w:t>
-      </w:r>
-    </w:p>
-    <w:p/>
-    <w:p>
-      <w:pPr>
-        <w:pStyle w:val="ListNumber"/>
-        <w:ind w:left="720"/>
-      </w:pPr>
-      <w:r>
-        <w:t>1. Open Book.</w:t>
-      </w:r>
-    </w:p>
-    <w:p>
-      <w:pPr>
-        <w:pStyle w:val="ListNumber"/>
-        <w:ind w:left="720"/>
-      </w:pPr>
-      <w:r>
-        <w:t>2. Select a court.</w:t>
-      </w:r>
-    </w:p>
-    <w:p>
-      <w:pPr>
-        <w:pStyle w:val="ListNumber"/>
-        <w:ind w:left="720"/>
-      </w:pPr>
-      <w:r>
-        <w:t>3. Select the booking date.</w:t>
-      </w:r>
-    </w:p>
-    <w:p>
-      <w:pPr>
-        <w:pStyle w:val="ListNumber"/>
-        <w:ind w:left="720"/>
-      </w:pPr>
-      <w:r>
-        <w:t>4. Select the start time.</w:t>
-      </w:r>
-    </w:p>
-    <w:p>
-      <w:pPr>
-        <w:pStyle w:val="ListNumber"/>
-        <w:ind w:left="720"/>
-      </w:pPr>
-      <w:r>
-        <w:t>5. Select the number of hours.</w:t>
-      </w:r>
-    </w:p>
-    <w:p>
-      <w:pPr>
-        <w:pStyle w:val="ListNumber"/>
-        <w:ind w:left="720"/>
-      </w:pPr>
-      <w:r>
-        <w:t>6. Confirm the slot is available.</w:t>
-      </w:r>
-    </w:p>
-    <w:p>
-      <w:pPr>
-        <w:pStyle w:val="ListNumber"/>
-        <w:ind w:left="720"/>
-      </w:pPr>
-      <w:r>
-        <w:t>7. Select Submit Booking Request.</w:t>
-      </w:r>
-    </w:p>
-    <w:p/>
-    <w:p>
-      <w:r>
-        <w:t>Booking rules:</w:t>
-      </w:r>
-    </w:p>
-    <w:p/>
-    <w:p>
-      <w:pPr>
-        <w:pStyle w:val="ListBullet"/>
-        <w:ind w:left="720"/>
-      </w:pPr>
-      <w:r>
-        <w:t>- Court rate is PHP 250.00 per hour.</w:t>
-      </w:r>
-    </w:p>
-    <w:p>
-      <w:pPr>
-        <w:pStyle w:val="ListBullet"/>
-        <w:ind w:left="720"/>
-      </w:pPr>
-      <w:r>
-        <w:t>- Default maximum booking duration is 4 hours.</w:t>
-      </w:r>
-    </w:p>
-    <w:p>
-      <w:pPr>
-        <w:pStyle w:val="ListBullet"/>
-        <w:ind w:left="720"/>
-      </w:pPr>
-      <w:r>
-        <w:t>- Bookings can run up to 11:00 PM.</w:t>
-      </w:r>
-    </w:p>
-    <w:p>
-      <w:pPr>
-        <w:pStyle w:val="ListBullet"/>
-        <w:ind w:left="720"/>
-      </w:pPr>
-      <w:r>
-        <w:t>- Pending, approved, and active bookings block overlapping reservations.</w:t>
-      </w:r>
-    </w:p>
-    <w:p>
-      <w:pPr>
-        <w:pStyle w:val="ListBullet"/>
-        <w:ind w:left="720"/>
-      </w:pPr>
-      <w:r>
-        <w:t>- Maintenance blocks prevent booking affected courts.</w:t>
-      </w:r>
-    </w:p>
-    <w:p/>
-    <w:p>
-      <w:pPr>
-        <w:pStyle w:val="Heading2"/>
-      </w:pPr>
-      <w:r>
-        <w:t>Upload Payment Proof</w:t>
-      </w:r>
-    </w:p>
-    <w:p/>
-    <w:p>
-      <w:pPr>
-        <w:pStyle w:val="ListNumber"/>
-        <w:ind w:left="720"/>
-      </w:pPr>
-      <w:r>
-        <w:t>1. Open Bookings.</w:t>
-      </w:r>
-    </w:p>
-    <w:p>
-      <w:pPr>
-        <w:pStyle w:val="ListNumber"/>
-        <w:ind w:left="720"/>
-      </w:pPr>
-      <w:r>
-        <w:t>2. Select the booking.</w:t>
-      </w:r>
-    </w:p>
-    <w:p>
-      <w:pPr>
-        <w:pStyle w:val="ListNumber"/>
-        <w:ind w:left="720"/>
-      </w:pPr>
-      <w:r>
-        <w:t>3. In Payment Proof, select a JPG, PNG, or PDF file.</w:t>
-      </w:r>
-    </w:p>
-    <w:p>
-      <w:pPr>
-        <w:pStyle w:val="ListNumber"/>
-        <w:ind w:left="720"/>
-      </w:pPr>
-      <w:r>
-        <w:t>4. Select Upload Proof.</w:t>
-      </w:r>
-    </w:p>
-    <w:p>
-      <w:pPr>
-        <w:pStyle w:val="ListNumber"/>
-        <w:ind w:left="720"/>
-      </w:pPr>
-      <w:r>
-        <w:t>5. Wait for admin verification.</w:t>
-      </w:r>
-    </w:p>
-    <w:p/>
-    <w:p>
-      <w:r>
-        <w:t>Payment proof files must be 8 MB or smaller.</w:t>
-      </w:r>
-    </w:p>
-    <w:p/>
-    <w:p>
-      <w:pPr>
-        <w:pStyle w:val="Heading2"/>
-      </w:pPr>
-      <w:r>
         <w:t>Track Bookings</w:t>
       </w:r>
     </w:p>
@@ -682,55 +1276,6 @@
         <w:pStyle w:val="Heading2"/>
       </w:pPr>
       <w:r>
-        <w:t>Notifications</w:t>
-      </w:r>
-    </w:p>
-    <w:p/>
-    <w:p>
-      <w:r>
-        <w:t>Open Notifications to see:</w:t>
-      </w:r>
-    </w:p>
-    <w:p/>
-    <w:p>
-      <w:pPr>
-        <w:pStyle w:val="ListBullet"/>
-        <w:ind w:left="720"/>
-      </w:pPr>
-      <w:r>
-        <w:t>- Booking updates.</w:t>
-      </w:r>
-    </w:p>
-    <w:p>
-      <w:pPr>
-        <w:pStyle w:val="ListBullet"/>
-        <w:ind w:left="720"/>
-      </w:pPr>
-      <w:r>
-        <w:t>- Time reminders.</w:t>
-      </w:r>
-    </w:p>
-    <w:p>
-      <w:pPr>
-        <w:pStyle w:val="ListBullet"/>
-        <w:ind w:left="720"/>
-      </w:pPr>
-      <w:r>
-        <w:t>- Admin messages.</w:t>
-      </w:r>
-    </w:p>
-    <w:p/>
-    <w:p>
-      <w:r>
-        <w:t>Admin messages display as full message cards so the content is easy to read. Use Mark All Read or the check button to clear unread indicators.</w:t>
-      </w:r>
-    </w:p>
-    <w:p/>
-    <w:p>
-      <w:pPr>
-        <w:pStyle w:val="Heading2"/>
-      </w:pPr>
-      <w:r>
         <w:t>Personal Progress</w:t>
       </w:r>
     </w:p>
@@ -815,69 +1360,11 @@
     </w:p>
     <w:p/>
     <w:p>
-      <w:r>
-        <w:t>The Dashboard also shows a quick progress summary and recent notifications.</w:t>
-      </w:r>
-    </w:p>
-    <w:p/>
-    <w:p>
-      <w:pPr>
-        <w:pStyle w:val="Heading2"/>
-      </w:pPr>
-      <w:r>
-        <w:t>Update Profile</w:t>
-      </w:r>
-    </w:p>
-    <w:p/>
-    <w:p>
-      <w:pPr>
-        <w:pStyle w:val="ListNumber"/>
-        <w:ind w:left="720"/>
-      </w:pPr>
-      <w:r>
-        <w:t>1. Open Profile.</w:t>
-      </w:r>
-    </w:p>
-    <w:p>
-      <w:pPr>
-        <w:pStyle w:val="ListNumber"/>
-        <w:ind w:left="720"/>
-      </w:pPr>
-      <w:r>
-        <w:t>2. Edit full name or contact number.</w:t>
-      </w:r>
-    </w:p>
-    <w:p>
-      <w:pPr>
-        <w:pStyle w:val="ListNumber"/>
-        <w:ind w:left="720"/>
-      </w:pPr>
-      <w:r>
-        <w:t>3. Select Change Profile Photo to choose a JPG or PNG image.</w:t>
-      </w:r>
-    </w:p>
-    <w:p>
-      <w:pPr>
-        <w:pStyle w:val="ListNumber"/>
-        <w:ind w:left="720"/>
-      </w:pPr>
-      <w:r>
-        <w:t>4. Select Save Profile.</w:t>
-      </w:r>
-    </w:p>
-    <w:p/>
-    <w:p>
-      <w:r>
-        <w:t>Profile photos must be 15 MB or smaller. The image preview updates immediately after selection and after saving.</w:t>
-      </w:r>
-    </w:p>
-    <w:p/>
-    <w:p>
       <w:pPr>
         <w:pStyle w:val="Heading1"/>
       </w:pPr>
       <w:r>
-        <w:t>5. Admin Guide</w:t>
+        <w:t>7. Admin Reference</w:t>
       </w:r>
     </w:p>
     <w:p/>
@@ -983,180 +1470,6 @@
         <w:pStyle w:val="Heading2"/>
       </w:pPr>
       <w:r>
-        <w:t>Review Bookings</w:t>
-      </w:r>
-    </w:p>
-    <w:p/>
-    <w:p>
-      <w:pPr>
-        <w:pStyle w:val="ListNumber"/>
-        <w:ind w:left="720"/>
-      </w:pPr>
-      <w:r>
-        <w:t>1. Open Bookings.</w:t>
-      </w:r>
-    </w:p>
-    <w:p>
-      <w:pPr>
-        <w:pStyle w:val="ListNumber"/>
-        <w:ind w:left="720"/>
-      </w:pPr>
-      <w:r>
-        <w:t>2. Search or filter by status, court, or date range.</w:t>
-      </w:r>
-    </w:p>
-    <w:p>
-      <w:pPr>
-        <w:pStyle w:val="ListNumber"/>
-        <w:ind w:left="720"/>
-      </w:pPr>
-      <w:r>
-        <w:t>3. Select a booking to view details.</w:t>
-      </w:r>
-    </w:p>
-    <w:p>
-      <w:pPr>
-        <w:pStyle w:val="ListNumber"/>
-        <w:ind w:left="720"/>
-      </w:pPr>
-      <w:r>
-        <w:t>4. Review payment proof if uploaded.</w:t>
-      </w:r>
-    </w:p>
-    <w:p>
-      <w:pPr>
-        <w:pStyle w:val="ListNumber"/>
-        <w:ind w:left="720"/>
-      </w:pPr>
-      <w:r>
-        <w:t>5. Select Approve, Decline, Cancel, or Complete when appropriate.</w:t>
-      </w:r>
-    </w:p>
-    <w:p/>
-    <w:p>
-      <w:r>
-        <w:t>Admin notes are shown to the customer on the booking details page.</w:t>
-      </w:r>
-    </w:p>
-    <w:p/>
-    <w:p>
-      <w:pPr>
-        <w:pStyle w:val="Heading2"/>
-      </w:pPr>
-      <w:r>
-        <w:t>Customer Management</w:t>
-      </w:r>
-    </w:p>
-    <w:p/>
-    <w:p>
-      <w:r>
-        <w:t>Open Customers to:</w:t>
-      </w:r>
-    </w:p>
-    <w:p/>
-    <w:p>
-      <w:pPr>
-        <w:pStyle w:val="ListBullet"/>
-        <w:ind w:left="720"/>
-      </w:pPr>
-      <w:r>
-        <w:t>- Search customer profiles.</w:t>
-      </w:r>
-    </w:p>
-    <w:p>
-      <w:pPr>
-        <w:pStyle w:val="ListBullet"/>
-        <w:ind w:left="720"/>
-      </w:pPr>
-      <w:r>
-        <w:t>- View customer profile photos.</w:t>
-      </w:r>
-    </w:p>
-    <w:p>
-      <w:pPr>
-        <w:pStyle w:val="ListBullet"/>
-        <w:ind w:left="720"/>
-      </w:pPr>
-      <w:r>
-        <w:t>- View booking count, rental hours, and verified payments.</w:t>
-      </w:r>
-    </w:p>
-    <w:p>
-      <w:pPr>
-        <w:pStyle w:val="ListBullet"/>
-        <w:ind w:left="720"/>
-      </w:pPr>
-      <w:r>
-        <w:t>- Review recent bookings.</w:t>
-      </w:r>
-    </w:p>
-    <w:p>
-      <w:pPr>
-        <w:pStyle w:val="ListBullet"/>
-        <w:ind w:left="720"/>
-      </w:pPr>
-      <w:r>
-        <w:t>- Send direct notifications.</w:t>
-      </w:r>
-    </w:p>
-    <w:p/>
-    <w:p>
-      <w:pPr>
-        <w:pStyle w:val="Heading2"/>
-      </w:pPr>
-      <w:r>
-        <w:t>Send Customer Notifications</w:t>
-      </w:r>
-    </w:p>
-    <w:p/>
-    <w:p>
-      <w:pPr>
-        <w:pStyle w:val="ListNumber"/>
-        <w:ind w:left="720"/>
-      </w:pPr>
-      <w:r>
-        <w:t>1. Open Customers.</w:t>
-      </w:r>
-    </w:p>
-    <w:p>
-      <w:pPr>
-        <w:pStyle w:val="ListNumber"/>
-        <w:ind w:left="720"/>
-      </w:pPr>
-      <w:r>
-        <w:t>2. Select Notify on the customer card.</w:t>
-      </w:r>
-    </w:p>
-    <w:p>
-      <w:pPr>
-        <w:pStyle w:val="ListNumber"/>
-        <w:ind w:left="720"/>
-      </w:pPr>
-      <w:r>
-        <w:t>3. Enter a title and message.</w:t>
-      </w:r>
-    </w:p>
-    <w:p>
-      <w:pPr>
-        <w:pStyle w:val="ListNumber"/>
-        <w:ind w:left="720"/>
-      </w:pPr>
-      <w:r>
-        <w:t>4. Select Send.</w:t>
-      </w:r>
-    </w:p>
-    <w:p/>
-    <w:p>
-      <w:r>
-        <w:t>The message appears in the customer's Notifications page as a full admin message card.</w:t>
-      </w:r>
-    </w:p>
-    <w:p/>
-    <w:p>
-      <w:pPr>
-        <w:pStyle w:val="Heading2"/>
-      </w:pPr>
-      <w:r>
         <w:t>Court Management</w:t>
       </w:r>
     </w:p>
@@ -1215,92 +1528,7 @@
     <w:p/>
     <w:p>
       <w:r>
-        <w:t>Open Active to see live countdown timers for rentals currently in progress. Timers update smoothly without requiring manual refresh.</w:t>
-      </w:r>
-    </w:p>
-    <w:p/>
-    <w:p>
-      <w:pPr>
-        <w:pStyle w:val="Heading2"/>
-      </w:pPr>
-      <w:r>
-        <w:t>Reports</w:t>
-      </w:r>
-    </w:p>
-    <w:p/>
-    <w:p>
-      <w:r>
-        <w:t>Open Reports to review:</w:t>
-      </w:r>
-    </w:p>
-    <w:p/>
-    <w:p>
-      <w:pPr>
-        <w:pStyle w:val="ListBullet"/>
-        <w:ind w:left="720"/>
-      </w:pPr>
-      <w:r>
-        <w:t>- Daily income.</w:t>
-      </w:r>
-    </w:p>
-    <w:p>
-      <w:pPr>
-        <w:pStyle w:val="ListBullet"/>
-        <w:ind w:left="720"/>
-      </w:pPr>
-      <w:r>
-        <w:t>- Weekly income.</w:t>
-      </w:r>
-    </w:p>
-    <w:p>
-      <w:pPr>
-        <w:pStyle w:val="ListBullet"/>
-        <w:ind w:left="720"/>
-      </w:pPr>
-      <w:r>
-        <w:t>- Monthly income.</w:t>
-      </w:r>
-    </w:p>
-    <w:p>
-      <w:pPr>
-        <w:pStyle w:val="ListBullet"/>
-        <w:ind w:left="720"/>
-      </w:pPr>
-      <w:r>
-        <w:t>- Most rented court.</w:t>
-      </w:r>
-    </w:p>
-    <w:p>
-      <w:pPr>
-        <w:pStyle w:val="ListBullet"/>
-        <w:ind w:left="720"/>
-      </w:pPr>
-      <w:r>
-        <w:t>- Top renters.</w:t>
-      </w:r>
-    </w:p>
-    <w:p>
-      <w:pPr>
-        <w:pStyle w:val="ListBullet"/>
-        <w:ind w:left="720"/>
-      </w:pPr>
-      <w:r>
-        <w:t>- Booking status summary.</w:t>
-      </w:r>
-    </w:p>
-    <w:p/>
-    <w:p>
-      <w:pPr>
-        <w:pStyle w:val="Heading2"/>
-      </w:pPr>
-      <w:r>
-        <w:t>Maintenance Scheduling</w:t>
-      </w:r>
-    </w:p>
-    <w:p/>
-    <w:p>
-      <w:r>
-        <w:t>Open Maintenance to block court time for maintenance or private events. Maintenance blocks prevent new bookings in the affected time range.</w:t>
+        <w:t>Open Active to see live countdown timers for rentals currently in play. Timers update smoothly without requiring manual refresh.</w:t>
       </w:r>
     </w:p>
     <w:p/>
@@ -1324,7 +1552,7 @@
         <w:pStyle w:val="Heading1"/>
       </w:pPr>
       <w:r>
-        <w:t>6. Real-Time Behavior</w:t>
+        <w:t>8. Real-Time Behavior</w:t>
       </w:r>
     </w:p>
     <w:p/>
@@ -1345,7 +1573,7 @@
         <w:pStyle w:val="Heading1"/>
       </w:pPr>
       <w:r>
-        <w:t>7. Setup Notes for Owners</w:t>
+        <w:t>9. Setup Notes for Owners</w:t>
       </w:r>
     </w:p>
     <w:p/>
@@ -1506,7 +1734,7 @@
         <w:pStyle w:val="Heading1"/>
       </w:pPr>
       <w:r>
-        <w:t>8. Troubleshooting</w:t>
+        <w:t>10. Troubleshooting</w:t>
       </w:r>
     </w:p>
     <w:p/>
@@ -1616,7 +1844,7 @@
         <w:pStyle w:val="Heading1"/>
       </w:pPr>
       <w:r>
-        <w:t>9. Recommended Client Handover Checklist</w:t>
+        <w:t>11. Recommended Client Handover Checklist</w:t>
       </w:r>
     </w:p>
     <w:p/>
@@ -1710,10 +1938,9 @@
         <w:t>- Confirm reports and active timers work.</w:t>
       </w:r>
     </w:p>
-    <w:p/>
     <w:sectPr>
       <w:pgSz w:w="12240" w:h="15840"/>
-      <w:pgMar w:top="1080" w:right="1080" w:bottom="1080" w:left="1080" w:header="720" w:footer="720" w:gutter="0"/>
+      <w:pgMar w:top="1080" w:right="900" w:bottom="1080" w:left="900" w:header="720" w:footer="720" w:gutter="0"/>
     </w:sectPr>
   </w:body>
 </w:document>
@@ -1779,16 +2006,10 @@
   <w:style w:type="paragraph" w:styleId="ListBullet">
     <w:name w:val="List Bullet"/>
     <w:basedOn w:val="Normal"/>
-    <w:rPr>
-      <w:sz w:val="22"/>
-    </w:rPr>
   </w:style>
   <w:style w:type="paragraph" w:styleId="ListNumber">
     <w:name w:val="List Number"/>
     <w:basedOn w:val="Normal"/>
-    <w:rPr>
-      <w:sz w:val="22"/>
-    </w:rPr>
   </w:style>
   <w:style w:type="paragraph" w:styleId="Code">
     <w:name w:val="Code"/>

</xml_diff>